<commit_message>
Manuscript v2: stop equating Wang Yun's 分別文 with 亦聲
Wang's own 分別文 examples (via O 2015: 469-473) include plain 聲 and
會意 characters and two 亦聲 characters filed outside their phonetic's
section (娶 under 女, 傾 under 人). The draft now says his third kind is
only the 在本部 subset, describes H4 as testing that subset alone, and
rewrites the abstract, introduction, section 2.1, 5.1 and conclusion
accordingly. Also notes how the L/F relation types differ from Wang's
criteria, fixes a section cross-reference in the AI-use statement, and
gives the Zhonghua 1988 reprint as cited by O.

Co-Authored-By: Claude Opus 5.5 (1M context) <noreply@anthropic.com>
Claude-Session: https://claude.ai/code/session_01DUE6qmVUYLALYANskiA97J
</commit_message>
<xml_diff>
--- a/youwen/manuscript/yisheng_paper_v2.docx
+++ b/youwen/manuscript/yisheng_paper_v2.docx
@@ -130,7 +130,25 @@
         <w:t xml:space="preserve">王筠</w:t>
       </w:r>
       <w:r>
-        <w:t xml:space="preserve"> (1837) proposed that one kind of</w:t>
+        <w:t xml:space="preserve"> (1837) counted</w:t>
+      </w:r>
+      <w:r>
+        <w:t xml:space="preserve"> </w:t>
+      </w:r>
+      <w:r>
+        <w:t xml:space="preserve">“differentiated graphs placed in their own section”</w:t>
+      </w:r>
+      <w:r>
+        <w:t xml:space="preserve"> </w:t>
+      </w:r>
+      <w:r>
+        <w:rPr>
+          <w:rFonts w:hint="eastAsia"/>
+        </w:rPr>
+        <w:t xml:space="preserve">(分別文之在本部者),</w:t>
+      </w:r>
+      <w:r>
+        <w:t xml:space="preserve"> new graphs for an existing word or one of its senses, as one kind of</w:t>
       </w:r>
       <w:r>
         <w:t xml:space="preserve"> </w:t>
@@ -143,19 +161,7 @@
         <w:t xml:space="preserve">yìshēng</w:t>
       </w:r>
       <w:r>
-        <w:t xml:space="preserve"> </w:t>
-      </w:r>
-      <w:r>
-        <w:t xml:space="preserve">character is a differentiated graph </w:t>
-      </w:r>
-      <w:r>
-        <w:rPr>
-          <w:rFonts w:hint="eastAsia"/>
-        </w:rPr>
-        <w:t xml:space="preserve">(分別文),</w:t>
-      </w:r>
-      <w:r>
-        <w:t xml:space="preserve"> a new graph for an existing word or for one of its senses, but the proposal has never been tested. We compare all 212 of Xu Shen’s own</w:t>
+        <w:t xml:space="preserve">, but his account has never been tested. We compare all 212 of Xu Shen’s own</w:t>
       </w:r>
       <w:r>
         <w:t xml:space="preserve"> </w:t>
@@ -187,7 +193,7 @@
         <w:t xml:space="preserve"> </w:t>
       </w:r>
       <w:r>
-        <w:t xml:space="preserve">thus marks a new graph for the same word or for a minimally derived one, not affixal derivation in general. The results make Wang Yun’s observation precise, give a quantitative basis to the critique of the</w:t>
+        <w:t xml:space="preserve">thus marks a new graph for the same word or for a minimally derived one, not affixal derivation in general. Differentiation in Wang’s sense is not confined to his third kind; the results also give a quantitative basis to the critique of the</w:t>
       </w:r>
       <w:r>
         <w:t xml:space="preserve"> </w:t>
@@ -629,7 +635,7 @@
         <w:t xml:space="preserve">王筠</w:t>
       </w:r>
       <w:r>
-        <w:t xml:space="preserve"> (1837), for whom one of three kinds of</w:t>
+        <w:t xml:space="preserve"> (1837). Among his three kinds of</w:t>
       </w:r>
       <w:r>
         <w:t xml:space="preserve"> </w:t>
@@ -645,16 +651,25 @@
         <w:t xml:space="preserve"> </w:t>
       </w:r>
       <w:r>
-        <w:t xml:space="preserve">is the differentiated graph </w:t>
-      </w:r>
-      <w:r>
-        <w:rPr>
-          <w:rFonts w:hint="eastAsia"/>
-        </w:rPr>
-        <w:t xml:space="preserve">(分別文),</w:t>
-      </w:r>
-      <w:r>
-        <w:t xml:space="preserve"> a new graph for a word or for one of its senses (Wang 1837, as quoted in Li &amp; Guo 2019). He gave no counts, however, and said nothing about the sounds of the two words.</w:t>
+        <w:t xml:space="preserve">are</w:t>
+      </w:r>
+      <w:r>
+        <w:t xml:space="preserve"> </w:t>
+      </w:r>
+      <w:r>
+        <w:t xml:space="preserve">“differentiated graphs placed in their own section”</w:t>
+      </w:r>
+      <w:r>
+        <w:t xml:space="preserve"> </w:t>
+      </w:r>
+      <w:r>
+        <w:rPr>
+          <w:rFonts w:hint="eastAsia"/>
+        </w:rPr>
+        <w:t xml:space="preserve">(分別文之在本部者),</w:t>
+      </w:r>
+      <w:r>
+        <w:t xml:space="preserve"> a differentiated graph being a new graph for a word or for one of its senses (Wang 1837, as quoted in Li &amp; Guo 2019). As far as the passages quoted in the secondary literature show, he gave no counts and did not compare the sounds of the two words.</w:t>
       </w:r>
     </w:p>
     <w:p>
@@ -694,31 +709,15 @@
         <w:t xml:space="preserve"> </w:t>
       </w:r>
       <w:r>
-        <w:t xml:space="preserve">marks a new graph for the same word, or for a minimally derived one. Wang’s differentiated graph, in other words, is not one kind of</w:t>
-      </w:r>
-      <w:r>
-        <w:t xml:space="preserve"> </w:t>
-      </w:r>
-      <w:r>
-        <w:rPr>
-          <w:i/>
-          <w:iCs/>
-        </w:rPr>
-        <w:t xml:space="preserve">yìshēng</w:t>
-      </w:r>
-      <w:r>
-        <w:t xml:space="preserve"> </w:t>
-      </w:r>
-      <w:r>
-        <w:t xml:space="preserve">among three; it comes close to being what the label is about.</w:t>
-      </w:r>
-    </w:p>
-    <w:p>
-      <w:pPr>
-        <w:pStyle w:val="BodyText"/>
-      </w:pPr>
-      <w:r>
-        <w:t xml:space="preserve">Besides giving Wang’s claim its first population-level, phonologically controlled test, the results separate graphic differentiation of one word and derivation by *-s from affixal derivation in general, and they show a native label identifying relatedness to an existing word without any semantic judgement on the analyst’s part, a point that bears on a live debate in morphological theory (Arad 2003; Rasin, Preminger &amp; Pesetsky 2024). Section 2 reviews the background, Sections 3 and 4 give the method and results, and Section 5 discusses them.</w:t>
+        <w:t xml:space="preserve">marks a new graph for the same word, or for a minimally derived one. That is close to what Wang called differentiation. It is not, however, concentrated in the subset that his third kind singles out by its filing, and Wang himself applied the term both inside and outside the label.</w:t>
+      </w:r>
+    </w:p>
+    <w:p>
+      <w:pPr>
+        <w:pStyle w:val="BodyText"/>
+      </w:pPr>
+      <w:r>
+        <w:t xml:space="preserve">Besides giving Wang’s account its first population-level, phonologically controlled test, the results separate graphic differentiation of one word and derivation by *-s from affixal derivation in general, and they show a native label identifying relatedness to an existing word without any semantic judgement on the analyst’s part, a point that bears on a live debate in morphological theory (Arad 2003; Rasin, Preminger &amp; Pesetsky 2024). Section 2 reviews the background, Sections 3 and 4 give the method and results, and Section 5 discusses them.</w:t>
       </w:r>
     </w:p>
     <w:bookmarkEnd w:id="9"/>
@@ -946,7 +945,16 @@
         <w:t xml:space="preserve">說文釋例</w:t>
       </w:r>
       <w:r>
-        <w:t xml:space="preserve"> (1837) asks what happens when a component is added to an existing graph. If the meaning changes, the result is a</w:t>
+        <w:t xml:space="preserve"> (1837) asks what happens when a component is added to an existing graph. If the meaning changes </w:t>
+      </w:r>
+      <w:r>
+        <w:rPr>
+          <w:rFonts w:hint="eastAsia"/>
+        </w:rPr>
+        <w:t xml:space="preserve">(其加偏旁而義遂異者),</w:t>
+      </w:r>
+      <w:r>
+        <w:t xml:space="preserve"> the result is a</w:t>
       </w:r>
       <w:r>
         <w:t xml:space="preserve"> </w:t>
@@ -974,10 +982,10 @@
         <w:rPr>
           <w:rFonts w:hint="eastAsia"/>
         </w:rPr>
-        <w:t xml:space="preserve">分別文);</w:t>
-      </w:r>
-      <w:r>
-        <w:t xml:space="preserve"> if it does not, the result is an</w:t>
+        <w:t xml:space="preserve">分別文),</w:t>
+      </w:r>
+      <w:r>
+        <w:t xml:space="preserve"> of which he distinguishes two sorts: either the original sense of the base graph had been usurped by a borrowed one and the new component keeps them apart, or the base graph had many senses and the new graph takes only one. If the meaning stays the same, the result is an</w:t>
       </w:r>
       <w:r>
         <w:t xml:space="preserve"> </w:t>
@@ -1008,7 +1016,7 @@
         <w:t xml:space="preserve">累增字)</w:t>
       </w:r>
       <w:r>
-        <w:t xml:space="preserve"> (Wang 1837, juan 8, as quoted in O 2015: 469). With this distinction in hand, Wang sorted the</w:t>
+        <w:t xml:space="preserve"> (Wang 1837, juan 8, leaf 1, as quoted in O 2015: 469). With this distinction in hand, Wang sorted the</w:t>
       </w:r>
       <w:r>
         <w:t xml:space="preserve"> </w:t>
@@ -1070,7 +1078,25 @@
         <w:pStyle w:val="FirstParagraph"/>
       </w:pPr>
       <w:r>
-        <w:t xml:space="preserve">We read the third kind as differentiated graphs that Xu files under the section headed by their base graph, such as </w:t>
+        <w:t xml:space="preserve">The third kind is narrower than it may look. We read </w:t>
+      </w:r>
+      <w:r>
+        <w:rPr>
+          <w:rFonts w:hint="eastAsia"/>
+        </w:rPr>
+        <w:t xml:space="preserve">在本部</w:t>
+      </w:r>
+      <w:r>
+        <w:t xml:space="preserve"> as</w:t>
+      </w:r>
+      <w:r>
+        <w:t xml:space="preserve"> </w:t>
+      </w:r>
+      <w:r>
+        <w:t xml:space="preserve">“filed in the section headed by the base graph”</w:t>
+      </w:r>
+      <w:r>
+        <w:t xml:space="preserve">, as </w:t>
       </w:r>
       <w:r>
         <w:rPr>
@@ -1079,58 +1105,148 @@
         <w:t xml:space="preserve">從</w:t>
       </w:r>
       <w:r>
+        <w:t xml:space="preserve"> is filed under </w:t>
+      </w:r>
+      <w:r>
+        <w:rPr>
+          <w:rFonts w:hint="eastAsia"/>
+        </w:rPr>
+        <w:t xml:space="preserve">从;</w:t>
+      </w:r>
+      <w:r>
+        <w:t xml:space="preserve"> Li and Guo (2019) quote the sentence without examples, so the reading is ours. Wang’s differentiated graphs form a far wider set. The examples he gives in juan 8 include characters that Xu analyses as ordinary phonetic or meaning compounds, </w:t>
+      </w:r>
+      <w:r>
+        <w:rPr>
+          <w:rFonts w:hint="eastAsia"/>
+        </w:rPr>
+        <w:t xml:space="preserve">恭</w:t>
+      </w:r>
+      <w:r>
+        <w:t xml:space="preserve"> from </w:t>
+      </w:r>
+      <w:r>
+        <w:rPr>
+          <w:rFonts w:hint="eastAsia"/>
+        </w:rPr>
+        <w:t xml:space="preserve">共</w:t>
+      </w:r>
+      <w:r>
+        <w:t xml:space="preserve"> </w:t>
+      </w:r>
+      <w:r>
+        <w:rPr>
+          <w:rFonts w:hint="eastAsia"/>
+        </w:rPr>
+        <w:t xml:space="preserve">(从心共聲)</w:t>
+      </w:r>
+      <w:r>
+        <w:t xml:space="preserve"> among them, and two that Xu labels</w:t>
+      </w:r>
+      <w:r>
+        <w:t xml:space="preserve"> </w:t>
+      </w:r>
+      <w:r>
+        <w:rPr>
+          <w:i/>
+          <w:iCs/>
+        </w:rPr>
+        <w:t xml:space="preserve">yìshēng</w:t>
+      </w:r>
+      <w:r>
+        <w:t xml:space="preserve"> </w:t>
+      </w:r>
+      <w:r>
+        <w:t xml:space="preserve">but files elsewhere: </w:t>
+      </w:r>
+      <w:r>
+        <w:rPr>
+          <w:rFonts w:hint="eastAsia"/>
+        </w:rPr>
+        <w:t xml:space="preserve">娶</w:t>
+      </w:r>
+      <w:r>
+        <w:t xml:space="preserve"> </w:t>
+      </w:r>
+      <w:r>
+        <w:t xml:space="preserve">“to take a wife”</w:t>
+      </w:r>
+      <w:r>
+        <w:t xml:space="preserve">,</w:t>
+      </w:r>
+      <w:r>
+        <w:t xml:space="preserve"> </w:t>
+      </w:r>
+      <w:r>
+        <w:t xml:space="preserve">“the differentiated graph of </w:t>
+      </w:r>
+      <w:r>
+        <w:rPr>
+          <w:rFonts w:hint="eastAsia"/>
+        </w:rPr>
+        <w:t xml:space="preserve">取”</w:t>
+      </w:r>
+      <w:r>
+        <w:t xml:space="preserve"> </w:t>
+      </w:r>
+      <w:r>
+        <w:rPr>
+          <w:rFonts w:hint="eastAsia"/>
+        </w:rPr>
+        <w:t xml:space="preserve">(女部娶爲取之分別文),</w:t>
+      </w:r>
+      <w:r>
         <w:t xml:space="preserve"> under </w:t>
       </w:r>
       <w:r>
         <w:rPr>
           <w:rFonts w:hint="eastAsia"/>
         </w:rPr>
-        <w:t xml:space="preserve">从.</w:t>
-      </w:r>
-      <w:r>
-        <w:t xml:space="preserve"> Wang thereby tied part of the label to graphic differentiation, the case in which a word, or one sense of it, acquires a graph of its own. </w:t>
-      </w:r>
-      <w:r>
-        <w:rPr>
-          <w:rFonts w:hint="eastAsia"/>
-        </w:rPr>
-        <w:t xml:space="preserve">琀</w:t>
-      </w:r>
-      <w:r>
-        <w:t xml:space="preserve"> </w:t>
-      </w:r>
-      <w:r>
-        <w:t xml:space="preserve">“jade placed in the mouth of the dead”</w:t>
-      </w:r>
-      <w:r>
-        <w:t xml:space="preserve"> </w:t>
-      </w:r>
-      <w:r>
-        <w:t xml:space="preserve">fits the description well: Duan notes that the classics mostly write the word </w:t>
-      </w:r>
-      <w:r>
-        <w:rPr>
-          <w:rFonts w:hint="eastAsia"/>
-        </w:rPr>
-        <w:t xml:space="preserve">含</w:t>
-      </w:r>
-      <w:r>
-        <w:t xml:space="preserve"> </w:t>
-      </w:r>
-      <w:r>
-        <w:t xml:space="preserve">“to hold in the mouth”</w:t>
-      </w:r>
-      <w:r>
-        <w:t xml:space="preserve"> </w:t>
-      </w:r>
-      <w:r>
-        <w:rPr>
-          <w:rFonts w:hint="eastAsia"/>
-        </w:rPr>
-        <w:t xml:space="preserve">(經傳多用含).</w:t>
-      </w:r>
-      <w:r>
-        <w:t xml:space="preserve"> Two cautions apply. Wang’s categories should not be conflated with the exegetical notion of</w:t>
+        <w:t xml:space="preserve">女,</w:t>
+      </w:r>
+      <w:r>
+        <w:t xml:space="preserve"> and </w:t>
+      </w:r>
+      <w:r>
+        <w:rPr>
+          <w:rFonts w:hint="eastAsia"/>
+        </w:rPr>
+        <w:t xml:space="preserve">傾</w:t>
+      </w:r>
+      <w:r>
+        <w:t xml:space="preserve"> </w:t>
+      </w:r>
+      <w:r>
+        <w:t xml:space="preserve">“to lean”</w:t>
+      </w:r>
+      <w:r>
+        <w:t xml:space="preserve">, from </w:t>
+      </w:r>
+      <w:r>
+        <w:rPr>
+          <w:rFonts w:hint="eastAsia"/>
+        </w:rPr>
+        <w:t xml:space="preserve">頃,</w:t>
+      </w:r>
+      <w:r>
+        <w:t xml:space="preserve"> under </w:t>
+      </w:r>
+      <w:r>
+        <w:rPr>
+          <w:rFonts w:hint="eastAsia"/>
+        </w:rPr>
+        <w:t xml:space="preserve">人</w:t>
+      </w:r>
+      <w:r>
+        <w:t xml:space="preserve"> (Wang 1837, juan 8, as quoted in O 2015: 471–473). On our reading, these two are differentiated graphs whose label falls under Wang’s first or second kind. Differentiation thus cuts across his three kinds and reaches beyond the label altogether; what the third kind adds is a criterion of filing. Whether Wang illustrates that kind with examples of its own cannot be settled from the secondary sources.</w:t>
+      </w:r>
+    </w:p>
+    <w:p>
+      <w:pPr>
+        <w:pStyle w:val="BodyText"/>
+      </w:pPr>
+      <w:r>
+        <w:t xml:space="preserve">Two cautions apply. Wang’s categories should not be conflated with the exegetical notion of</w:t>
       </w:r>
       <w:r>
         <w:t xml:space="preserve"> </w:t>
@@ -1157,7 +1273,7 @@
         <w:t xml:space="preserve">徐灝</w:t>
       </w:r>
       <w:r>
-        <w:t xml:space="preserve"> rather than to Wang himself. More importantly for us, Wang offered a classification of characters, not a claim about how often the label and the differentiated graph coincide, or with what relation of sound.</w:t>
+        <w:t xml:space="preserve"> rather than to Wang himself. Nor, in the passages available to us, does Wang ask how often the label and the differentiated graph coincide, or with what relation of sound.</w:t>
       </w:r>
     </w:p>
     <w:p>
@@ -1689,7 +1805,7 @@
           <w:b/>
           <w:bCs/>
         </w:rPr>
-        <w:t xml:space="preserve">H4 (Wang Yun’s third kind; exploratory).</w:t>
+        <w:t xml:space="preserve">H4 (the filing criterion of Wang Yun’s third kind; exploratory).</w:t>
       </w:r>
       <w:r>
         <w:t xml:space="preserve"> </w:t>
@@ -2278,16 +2394,16 @@
         <w:t xml:space="preserve">兩</w:t>
       </w:r>
       <w:r>
-        <w:t xml:space="preserve"> under 㒳, and we take these to be Wang Yun’s</w:t>
-      </w:r>
-      <w:r>
-        <w:t xml:space="preserve"> </w:t>
-      </w:r>
-      <w:r>
-        <w:t xml:space="preserve">“differentiated graphs placed in their own section”</w:t>
-      </w:r>
-      <w:r>
-        <w:t xml:space="preserve">. Their label follows from Xu’s filing system, a section head being by definition the meaningful component, and no ordinary compound is ever filed this way. Every main model is therefore also run without them (H4).</w:t>
+        <w:t xml:space="preserve"> under 㒳. On our reading of </w:t>
+      </w:r>
+      <w:r>
+        <w:rPr>
+          <w:rFonts w:hint="eastAsia"/>
+        </w:rPr>
+        <w:t xml:space="preserve">在本部</w:t>
+      </w:r>
+      <w:r>
+        <w:t xml:space="preserve"> they are the candidates for Wang Yun’s third kind, and H4 tests this subset only, not his differentiated graphs as a whole, which include labelled characters filed elsewhere (Section 2.1). Their label also follows from Xu’s filing system, a section head being by definition the meaningful component, and no ordinary compound is ever filed this way. Every main model is therefore also run without them (H4).</w:t>
       </w:r>
     </w:p>
     <w:bookmarkEnd w:id="15"/>
@@ -2541,7 +2657,25 @@
         <w:t xml:space="preserve">(分別文,</w:t>
       </w:r>
       <w:r>
-        <w:t xml:space="preserve"> F), a change of word class (conversion, C), an unrelated homophone or phonetic loan (U), or a proper name (X). The first coder made it with the labels visible.</w:t>
+        <w:t xml:space="preserve"> F), a change of word class (conversion, C), an unrelated homophone or phonetic loan (U), or a proper name (X). The first coder made it with the labels visible. These categories borrow Wang’s terms but not his criteria. Ours classify the relation between the two words, his what the added component does to the base graph, and the two can disagree: </w:t>
+      </w:r>
+      <w:r>
+        <w:rPr>
+          <w:rFonts w:hint="eastAsia"/>
+        </w:rPr>
+        <w:t xml:space="preserve">傾,</w:t>
+      </w:r>
+      <w:r>
+        <w:t xml:space="preserve"> which Wang counts as a differentiated graph of </w:t>
+      </w:r>
+      <w:r>
+        <w:rPr>
+          <w:rFonts w:hint="eastAsia"/>
+        </w:rPr>
+        <w:t xml:space="preserve">頃,</w:t>
+      </w:r>
+      <w:r>
+        <w:t xml:space="preserve"> was coded L. L and F together are therefore the closer counterpart of Wang’s two categories.</w:t>
       </w:r>
     </w:p>
     <w:bookmarkEnd w:id="17"/>
@@ -4263,13 +4397,13 @@
       </w:r>
     </w:p>
     <w:bookmarkEnd w:id="23"/>
-    <w:bookmarkStart w:id="24" w:name="X76ab7a4719e6f64999a1218e64fb25a0a5d72a7"/>
+    <w:bookmarkStart w:id="24" w:name="recensions-and-filing-position-h3-h4"/>
     <w:p>
       <w:pPr>
         <w:pStyle w:val="Heading3"/>
       </w:pPr>
       <w:r>
-        <w:t xml:space="preserve">4.5 Recensions and Wang Yun’s third kind (H3, H4)</w:t>
+        <w:t xml:space="preserve">4.5 Recensions and filing position (H3, H4)</w:t>
       </w:r>
     </w:p>
     <w:p>
@@ -4357,7 +4491,7 @@
         <w:pStyle w:val="BodyText"/>
       </w:pPr>
       <w:r>
-        <w:t xml:space="preserve">Filing position fares no better. The 40 labels filed under their own phonetic are less, not more, often homophonous than the others (9 of 34, 26.5%, against 54 of 143, 37.8%; Fisher p = 0.24, two-sided).</w:t>
+        <w:t xml:space="preserve">Filing position fares no better. The 40 labels filed under their own phonetic, our candidates for Wang’s third kind, are less, not more, often homophonous than the others (9 of 34, 26.5%, against 54 of 143, 37.8%; Fisher p = 0.24, two-sided).</w:t>
       </w:r>
     </w:p>
     <w:bookmarkEnd w:id="24"/>
@@ -4669,13 +4803,31 @@
         <w:t xml:space="preserve">琀</w:t>
       </w:r>
       <w:r>
-        <w:t xml:space="preserve"> writes with a graph of its own a word that the classics write </w:t>
-      </w:r>
-      <w:r>
-        <w:rPr>
-          <w:rFonts w:hint="eastAsia"/>
-        </w:rPr>
-        <w:t xml:space="preserve">含.</w:t>
+        <w:t xml:space="preserve"> </w:t>
+      </w:r>
+      <w:r>
+        <w:t xml:space="preserve">“jade placed in the mouth of the dead”</w:t>
+      </w:r>
+      <w:r>
+        <w:t xml:space="preserve"> </w:t>
+      </w:r>
+      <w:r>
+        <w:t xml:space="preserve">writes with a graph of its own a word that the classics, as Duan notes, mostly write </w:t>
+      </w:r>
+      <w:r>
+        <w:rPr>
+          <w:rFonts w:hint="eastAsia"/>
+        </w:rPr>
+        <w:t xml:space="preserve">含</w:t>
+      </w:r>
+      <w:r>
+        <w:t xml:space="preserve"> </w:t>
+      </w:r>
+      <w:r>
+        <w:rPr>
+          <w:rFonts w:hint="eastAsia"/>
+        </w:rPr>
+        <w:t xml:space="preserve">(經傳多用含).</w:t>
       </w:r>
       <w:r>
         <w:t xml:space="preserve"> Conversion, a change of word class without change of form, is rarer, with five homophonous labelled pairs in the first-pass coding and none among ordinary ones. Derivation by *-s, as in </w:t>
@@ -4714,23 +4866,132 @@
         <w:t xml:space="preserve">平,</w:t>
       </w:r>
       <w:r>
-        <w:t xml:space="preserve"> makes up the rest. Only this last relation is derivation in the phonological sense. The other two are, in the terms of Section 2.3, graphic events: the word stays what it was, and the script gives it, or one of its senses, a new shape. Wang saw the core of this in 1837, but the population shows two things that he could not. Differentiated graphs are not one kind of</w:t>
-      </w:r>
-      <w:r>
-        <w:t xml:space="preserve"> </w:t>
-      </w:r>
-      <w:r>
-        <w:rPr>
-          <w:i/>
-          <w:iCs/>
-        </w:rPr>
-        <w:t xml:space="preserve">yìshēng</w:t>
-      </w:r>
-      <w:r>
-        <w:t xml:space="preserve"> </w:t>
-      </w:r>
-      <w:r>
-        <w:t xml:space="preserve">among three; on the first-pass coding they make up two in three of the homophonous labelled pairs, while the structural criterion Wang attached to them, filing under the phonetic’s own section, does not pick out homophony at all (Section 4.5). The relation he identified runs through the label as a whole. And where his graphic categories cannot tell a new graph for the same word from a new graph for its *-s derivative, the sound relations can, and the label turns out to be sensitive to both.</w:t>
+        <w:t xml:space="preserve"> makes up the rest. Only this last relation is derivation in the phonological sense. The other two are, in the terms of Section 2.3, graphic events: the word stays what it was, and the script gives it, or one of its senses, a new shape.</w:t>
+      </w:r>
+    </w:p>
+    <w:p>
+      <w:pPr>
+        <w:pStyle w:val="BodyText"/>
+      </w:pPr>
+      <w:r>
+        <w:t xml:space="preserve">Wang described much of this in 1837, and two of his own examples show both relations at once. </w:t>
+      </w:r>
+      <w:r>
+        <w:rPr>
+          <w:rFonts w:hint="eastAsia"/>
+        </w:rPr>
+        <w:t xml:space="preserve">傾</w:t>
+      </w:r>
+      <w:r>
+        <w:t xml:space="preserve"> is read exactly like </w:t>
+      </w:r>
+      <w:r>
+        <w:rPr>
+          <w:rFonts w:hint="eastAsia"/>
+        </w:rPr>
+        <w:t xml:space="preserve">頃</w:t>
+      </w:r>
+      <w:r>
+        <w:t xml:space="preserve"> (</w:t>
+      </w:r>
+      <w:r>
+        <w:rPr>
+          <w:i/>
+          <w:iCs/>
+        </w:rPr>
+        <w:t xml:space="preserve">khjwieng</w:t>
+      </w:r>
+      <w:r>
+        <w:t xml:space="preserve">). </w:t>
+      </w:r>
+      <w:r>
+        <w:rPr>
+          <w:rFonts w:hint="eastAsia"/>
+        </w:rPr>
+        <w:t xml:space="preserve">娶</w:t>
+      </w:r>
+      <w:r>
+        <w:t xml:space="preserve"> </w:t>
+      </w:r>
+      <w:r>
+        <w:t xml:space="preserve">“to take a wife”</w:t>
+      </w:r>
+      <w:r>
+        <w:t xml:space="preserve"> </w:t>
+      </w:r>
+      <w:r>
+        <w:t xml:space="preserve">is the departing-tone member beside </w:t>
+      </w:r>
+      <w:r>
+        <w:rPr>
+          <w:rFonts w:hint="eastAsia"/>
+        </w:rPr>
+        <w:t xml:space="preserve">取</w:t>
+      </w:r>
+      <w:r>
+        <w:t xml:space="preserve"> </w:t>
+      </w:r>
+      <w:r>
+        <w:t xml:space="preserve">“to take”</w:t>
+      </w:r>
+      <w:r>
+        <w:t xml:space="preserve"> </w:t>
+      </w:r>
+      <w:r>
+        <w:t xml:space="preserve">(</w:t>
+      </w:r>
+      <w:r>
+        <w:rPr>
+          <w:i/>
+          <w:iCs/>
+        </w:rPr>
+        <w:t xml:space="preserve">tshjuH</w:t>
+      </w:r>
+      <w:r>
+        <w:t xml:space="preserve"> </w:t>
+      </w:r>
+      <w:r>
+        <w:t xml:space="preserve">beside</w:t>
+      </w:r>
+      <w:r>
+        <w:t xml:space="preserve"> </w:t>
+      </w:r>
+      <w:r>
+        <w:rPr>
+          <w:i/>
+          <w:iCs/>
+        </w:rPr>
+        <w:t xml:space="preserve">tshjuX</w:t>
+      </w:r>
+      <w:r>
+        <w:t xml:space="preserve">), the relation tested in H1c, yet Wang calls it a differentiated graph all the same. What the population adds is scale, and a test of the filing criterion. On the first-pass coding, a new graph for the same word or for one of its senses (L or F) accounts for 50 of the 63 homophonous labelled pairs, against 18 of the 133 homophonous ordinary ones. The filing criterion, by contrast, does not pick out homophony at all (Section 4.5), and both of Wang’s labelled examples are filed elsewhere. Differentiation runs through the label, not through one kind of it. It also runs beyond the label, since Wang applied the term to characters such as </w:t>
+      </w:r>
+      <w:r>
+        <w:rPr>
+          <w:rFonts w:hint="eastAsia"/>
+        </w:rPr>
+        <w:t xml:space="preserve">恭</w:t>
+      </w:r>
+      <w:r>
+        <w:t xml:space="preserve"> that Xu treats as ordinary compounds; the label is best read as marking the pairs in which Xu recognised the relation, a reliable but not exhaustive sample of it. And where Wang’s graphic categories treat </w:t>
+      </w:r>
+      <w:r>
+        <w:rPr>
+          <w:rFonts w:hint="eastAsia"/>
+        </w:rPr>
+        <w:t xml:space="preserve">傾</w:t>
+      </w:r>
+      <w:r>
+        <w:t xml:space="preserve"> and </w:t>
+      </w:r>
+      <w:r>
+        <w:rPr>
+          <w:rFonts w:hint="eastAsia"/>
+        </w:rPr>
+        <w:t xml:space="preserve">娶</w:t>
+      </w:r>
+      <w:r>
+        <w:t xml:space="preserve"> alike, the sound relations tell them apart, and the label proves sensitive to both.</w:t>
       </w:r>
     </w:p>
     <w:p>
@@ -4938,7 +5199,23 @@
         <w:t xml:space="preserve"> </w:t>
       </w:r>
       <w:r>
-        <w:t xml:space="preserve">and a Xiǎo Xú e-text too incomplete to test H3; every cited form, and Wang Yun’s wording, quoted here at second hand, must be checked in print, above all against the 1963 Zhonghua facsimile of the Dà Xú. And because the hypotheses were refined after an exploratory look, every test is reported, the null for H1b and the unplanned decomposition of H1c included.</w:t>
+        <w:t xml:space="preserve">and a Xiǎo Xú e-text too incomplete to test H3; every cited form must be checked in print, above all against the 1963 Zhonghua facsimile of the Dà Xú. Wang Yun, moreover, is quoted here at second hand, and our reading of his third kind, including whether his</w:t>
+      </w:r>
+      <w:r>
+        <w:t xml:space="preserve"> </w:t>
+      </w:r>
+      <w:r>
+        <w:rPr>
+          <w:i/>
+          <w:iCs/>
+        </w:rPr>
+        <w:t xml:space="preserve">yìshēng</w:t>
+      </w:r>
+      <w:r>
+        <w:t xml:space="preserve"> </w:t>
+      </w:r>
+      <w:r>
+        <w:t xml:space="preserve">section gives examples of it, awaits the original. And because the hypotheses were refined after an exploratory look, every test is reported, the null for H1b and the unplanned decomposition of H1c included.</w:t>
       </w:r>
     </w:p>
     <w:bookmarkEnd w:id="31"/>
@@ -4972,7 +5249,7 @@
         <w:t xml:space="preserve"> </w:t>
       </w:r>
       <w:r>
-        <w:t xml:space="preserve">label an implicit marker of derivation? Only in part. It reliably marks the same word under a new graph, and it marks derivation by *-s; affixal derivation in general leaves no trace in it. Labelled characters are homophonous with their phonetic more than twice as often as ordinary compounds on the same phonetics, stand more often in the departing-tone relation to it, and are far more often related to it in meaning, paronomastic glosses aside. Wang Yun recognised the core of this when he counted differentiated graphs among the kinds of</w:t>
+        <w:t xml:space="preserve">label an implicit marker of derivation? Only in part. It reliably marks the same word under a new graph, and it marks derivation by *-s; affixal derivation in general leaves no trace in it. Labelled characters are homophonous with their phonetic more than twice as often as ordinary compounds on the same phonetics, stand more often in the departing-tone relation to it, and are far more often related to it in meaning, paronomastic glosses aside. Wang Yun recognised much of this when he made differentiated graphs filed in their own section a kind of</w:t>
       </w:r>
       <w:r>
         <w:t xml:space="preserve"> </w:t>
@@ -4985,7 +5262,7 @@
         <w:t xml:space="preserve">yìshēng</w:t>
       </w:r>
       <w:r>
-        <w:t xml:space="preserve">. Tested on the whole population, his differentiated graph comes close to being what the label is about, and part of it proves to be derivational.</w:t>
+        <w:t xml:space="preserve">. Tested on the whole population, differentiation turns out not to depend on filing: it runs through the label as a whole, and part of it proves to be derivational.</w:t>
       </w:r>
     </w:p>
     <w:p>
@@ -5115,7 +5392,7 @@
         <w:t xml:space="preserve"> </w:t>
       </w:r>
       <w:r>
-        <w:t xml:space="preserve">[placeholder; adapt to the journal’s current policy]. An LLM-based assistant (Claude, Anthropic) was used to extract and organise the data, run the statistical scripts and draft the text. Both semantic codings in Section 3.4 were made by LLM instances, one of them blind to the label; they are reported as agreement between two LLM codings, not as human inter-coder reliability. The author checked [to be specified] and takes full responsibility for the content.</w:t>
+        <w:t xml:space="preserve">[placeholder; adapt to the journal’s current policy]. An LLM-based assistant (Claude, Anthropic) was used to extract and organise the data, run the statistical scripts and draft the text. Both semantic codings in Section 3.3 were made by LLM instances, one of them blind to the label; they are reported as agreement between two LLM codings, not as human inter-coder reliability. The author checked [to be specified] and takes full responsibility for the content.</w:t>
       </w:r>
     </w:p>
     <w:p>
@@ -6304,7 +6581,7 @@
         <w:t xml:space="preserve">Shuōwén</w:t>
       </w:r>
       <w:r>
-        <w:t xml:space="preserve">]. [Edition to be fixed; quoted here through O 2015 and Li &amp; Guo 2019.] †</w:t>
+        <w:t xml:space="preserve">]. Reprint, Beijing: Zhonghua shuju, 1988 (as cited in O 2015; edition and date not yet checked). Quoted here through O 2015 and Li &amp; Guo 2019. †</w:t>
       </w:r>
     </w:p>
     <w:p>

</xml_diff>

<commit_message>
Manuscript v2: correct 娶 and add Wang Yun's Xiao Xu remarks
The juan 8 scan shows that Wang calls 娶 a 分別文 but rejects Da Xu's
亦聲 analysis of it as 非例 in favour of Xiao Xu's 取聲, and treats Da
Xu's 婚 and 媄 the same way; he accepts the label on 傾 and 𨻺. Section
2.1 now gives his view that Xu's convention for such graphs is a plain
phonetic (援 爰聲), 5.1 no longer counts 娶 as a label Wang accepts,
4.5 adds his report on Xiao Xu as a partial H3 check, and the
limitations note what this means for attributing the labels to Xu
Shen. Juan 8 is cited by leaf from a first-pass transcription.

Co-Authored-By: Claude Opus 5.5 (1M context) <noreply@anthropic.com>
Claude-Session: https://claude.ai/code/session_01DUE6qmVUYLALYANskiA97J
</commit_message>
<xml_diff>
--- a/youwen/manuscript/yisheng_paper_v2.docx
+++ b/youwen/manuscript/yisheng_paper_v2.docx
@@ -669,7 +669,7 @@
         <w:t xml:space="preserve">(分別文之在本部者),</w:t>
       </w:r>
       <w:r>
-        <w:t xml:space="preserve"> a differentiated graph being a new graph for a word or for one of its senses (Wang 1837, as quoted in Li &amp; Guo 2019). As far as the passages quoted in the secondary literature show, he gave no counts and did not compare the sounds of the two words.</w:t>
+        <w:t xml:space="preserve"> a differentiated graph being a new graph for a word or for one of its senses (Wang 1837, as quoted in Li &amp; Guo 2019). As far as the passages read for this study show, he gave no counts and did not compare the sounds of the two words.</w:t>
       </w:r>
     </w:p>
     <w:p>
@@ -1016,7 +1016,7 @@
         <w:t xml:space="preserve">累增字)</w:t>
       </w:r>
       <w:r>
-        <w:t xml:space="preserve"> (Wang 1837, juan 8, leaf 1, as quoted in O 2015: 469). With this distinction in hand, Wang sorted the</w:t>
+        <w:t xml:space="preserve"> (Wang 1837, juan 8, 1a–1b). With this distinction in hand, Wang sorted the</w:t>
       </w:r>
       <w:r>
         <w:t xml:space="preserve"> </w:t>
@@ -1111,10 +1111,112 @@
         <w:rPr>
           <w:rFonts w:hint="eastAsia"/>
         </w:rPr>
-        <w:t xml:space="preserve">从;</w:t>
-      </w:r>
-      <w:r>
-        <w:t xml:space="preserve"> Li and Guo (2019) quote the sentence without examples, so the reading is ours. Wang’s differentiated graphs form a far wider set. The examples he gives in juan 8 include characters that Xu analyses as ordinary phonetic or meaning compounds, </w:t>
+        <w:t xml:space="preserve">从.</w:t>
+      </w:r>
+      <w:r>
+        <w:t xml:space="preserve"> Li and Guo (2019) quote the sentence without examples, so the reading is ours, but juan 8 gives it some support. Wang introduces differentiated and accumulated graphs there as</w:t>
+      </w:r>
+      <w:r>
+        <w:t xml:space="preserve"> </w:t>
+      </w:r>
+      <w:r>
+        <w:t xml:space="preserve">“variant graphs in different sections”</w:t>
+      </w:r>
+      <w:r>
+        <w:t xml:space="preserve"> </w:t>
+      </w:r>
+      <w:r>
+        <w:rPr>
+          <w:rFonts w:hint="eastAsia"/>
+        </w:rPr>
+        <w:t xml:space="preserve">(異部重文),</w:t>
+      </w:r>
+      <w:r>
+        <w:t xml:space="preserve"> and he holds that Xu words their analyses in a special way, giving the base graph simply as the phonetic: under </w:t>
+      </w:r>
+      <w:r>
+        <w:rPr>
+          <w:rFonts w:hint="eastAsia"/>
+        </w:rPr>
+        <w:t xml:space="preserve">援</w:t>
+      </w:r>
+      <w:r>
+        <w:t xml:space="preserve"> Xu writes only </w:t>
+      </w:r>
+      <w:r>
+        <w:rPr>
+          <w:rFonts w:hint="eastAsia"/>
+        </w:rPr>
+        <w:t xml:space="preserve">爰聲,</w:t>
+      </w:r>
+      <w:r>
+        <w:t xml:space="preserve"> not</w:t>
+      </w:r>
+      <w:r>
+        <w:t xml:space="preserve"> </w:t>
+      </w:r>
+      <w:r>
+        <w:t xml:space="preserve">“from </w:t>
+      </w:r>
+      <w:r>
+        <w:rPr>
+          <w:rFonts w:hint="eastAsia"/>
+        </w:rPr>
+        <w:t xml:space="preserve">爰”</w:t>
+      </w:r>
+      <w:r>
+        <w:t xml:space="preserve">,</w:t>
+      </w:r>
+      <w:r>
+        <w:t xml:space="preserve"> </w:t>
+      </w:r>
+      <w:r>
+        <w:t xml:space="preserve">“to show that they are one word”</w:t>
+      </w:r>
+      <w:r>
+        <w:t xml:space="preserve"> </w:t>
+      </w:r>
+      <w:r>
+        <w:rPr>
+          <w:rFonts w:hint="eastAsia"/>
+        </w:rPr>
+        <w:t xml:space="preserve">(以著其爲一字也;</w:t>
+      </w:r>
+      <w:r>
+        <w:t xml:space="preserve"> Wang 1837, juan 8, 1a–1b). The definition itself never mentions</w:t>
+      </w:r>
+      <w:r>
+        <w:t xml:space="preserve"> </w:t>
+      </w:r>
+      <w:r>
+        <w:rPr>
+          <w:i/>
+          <w:iCs/>
+        </w:rPr>
+        <w:t xml:space="preserve">yìshēng</w:t>
+      </w:r>
+      <w:r>
+        <w:t xml:space="preserve">. If such a graph filed elsewhere normally takes a plain phonetic, the label is to be expected chiefly where the base heads the section, since there</w:t>
+      </w:r>
+      <w:r>
+        <w:t xml:space="preserve"> </w:t>
+      </w:r>
+      <w:r>
+        <w:t xml:space="preserve">“from X”</w:t>
+      </w:r>
+      <w:r>
+        <w:t xml:space="preserve"> </w:t>
+      </w:r>
+      <w:r>
+        <w:t xml:space="preserve">comes with the filing.</w:t>
+      </w:r>
+    </w:p>
+    <w:p>
+      <w:pPr>
+        <w:pStyle w:val="BodyText"/>
+      </w:pPr>
+      <w:r>
+        <w:t xml:space="preserve">Wang’s own examples bear this out only in part. Some, such as </w:t>
       </w:r>
       <w:r>
         <w:rPr>
@@ -1138,26 +1240,79 @@
         <w:rPr>
           <w:rFonts w:hint="eastAsia"/>
         </w:rPr>
-        <w:t xml:space="preserve">(从心共聲)</w:t>
-      </w:r>
-      <w:r>
-        <w:t xml:space="preserve"> among them, and two that Xu labels</w:t>
-      </w:r>
-      <w:r>
-        <w:t xml:space="preserve"> </w:t>
-      </w:r>
-      <w:r>
-        <w:rPr>
-          <w:i/>
-          <w:iCs/>
-        </w:rPr>
-        <w:t xml:space="preserve">yìshēng</w:t>
-      </w:r>
-      <w:r>
-        <w:t xml:space="preserve"> </w:t>
-      </w:r>
-      <w:r>
-        <w:t xml:space="preserve">but files elsewhere: </w:t>
+        <w:t xml:space="preserve">(从心共聲),</w:t>
+      </w:r>
+      <w:r>
+        <w:t xml:space="preserve"> are ordinary phonetic compounds in Xu’s text (O 2015: 471–473). </w:t>
+      </w:r>
+      <w:r>
+        <w:rPr>
+          <w:rFonts w:hint="eastAsia"/>
+        </w:rPr>
+        <w:t xml:space="preserve">傾</w:t>
+      </w:r>
+      <w:r>
+        <w:t xml:space="preserve"> </w:t>
+      </w:r>
+      <w:r>
+        <w:t xml:space="preserve">“to lean”</w:t>
+      </w:r>
+      <w:r>
+        <w:t xml:space="preserve"> </w:t>
+      </w:r>
+      <w:r>
+        <w:t xml:space="preserve">and </w:t>
+      </w:r>
+      <w:r>
+        <w:rPr>
+          <w:rFonts w:hint="eastAsia"/>
+        </w:rPr>
+        <w:t xml:space="preserve">𨻺,</w:t>
+      </w:r>
+      <w:r>
+        <w:t xml:space="preserve"> both glossed </w:t>
+      </w:r>
+      <w:r>
+        <w:rPr>
+          <w:rFonts w:hint="eastAsia"/>
+        </w:rPr>
+        <w:t xml:space="preserve">仄也,</w:t>
+      </w:r>
+      <w:r>
+        <w:t xml:space="preserve"> he quotes with their label, </w:t>
+      </w:r>
+      <w:r>
+        <w:rPr>
+          <w:rFonts w:hint="eastAsia"/>
+        </w:rPr>
+        <w:t xml:space="preserve">从頃，頃亦聲,</w:t>
+      </w:r>
+      <w:r>
+        <w:t xml:space="preserve"> without objecting to it, and counts both as differentiated graphs of </w:t>
+      </w:r>
+      <w:r>
+        <w:rPr>
+          <w:rFonts w:hint="eastAsia"/>
+        </w:rPr>
+        <w:t xml:space="preserve">頃</w:t>
+      </w:r>
+      <w:r>
+        <w:t xml:space="preserve"> </w:t>
+      </w:r>
+      <w:r>
+        <w:t xml:space="preserve">“head askew”</w:t>
+      </w:r>
+      <w:r>
+        <w:t xml:space="preserve">, though neither is filed under </w:t>
+      </w:r>
+      <w:r>
+        <w:rPr>
+          <w:rFonts w:hint="eastAsia"/>
+        </w:rPr>
+        <w:t xml:space="preserve">頃</w:t>
+      </w:r>
+      <w:r>
+        <w:t xml:space="preserve"> (6a–6b). </w:t>
       </w:r>
       <w:r>
         <w:rPr>
@@ -1172,7 +1327,10 @@
         <w:t xml:space="preserve">“to take a wife”</w:t>
       </w:r>
       <w:r>
-        <w:t xml:space="preserve">,</w:t>
+        <w:t xml:space="preserve"> </w:t>
+      </w:r>
+      <w:r>
+        <w:t xml:space="preserve">he calls</w:t>
       </w:r>
       <w:r>
         <w:t xml:space="preserve"> </w:t>
@@ -1196,13 +1354,49 @@
         <w:t xml:space="preserve">(女部娶爲取之分別文),</w:t>
       </w:r>
       <w:r>
-        <w:t xml:space="preserve"> under </w:t>
-      </w:r>
-      <w:r>
-        <w:rPr>
-          <w:rFonts w:hint="eastAsia"/>
-        </w:rPr>
-        <w:t xml:space="preserve">女,</w:t>
+        <w:t xml:space="preserve"> but he prefers Xiǎo Xú’s </w:t>
+      </w:r>
+      <w:r>
+        <w:rPr>
+          <w:rFonts w:hint="eastAsia"/>
+        </w:rPr>
+        <w:t xml:space="preserve">取聲</w:t>
+      </w:r>
+      <w:r>
+        <w:t xml:space="preserve"> and dismisses Dà Xú’s </w:t>
+      </w:r>
+      <w:r>
+        <w:rPr>
+          <w:rFonts w:hint="eastAsia"/>
+        </w:rPr>
+        <w:t xml:space="preserve">从取，取亦聲</w:t>
+      </w:r>
+      <w:r>
+        <w:t xml:space="preserve"> as</w:t>
+      </w:r>
+      <w:r>
+        <w:t xml:space="preserve"> </w:t>
+      </w:r>
+      <w:r>
+        <w:t xml:space="preserve">“not the convention”</w:t>
+      </w:r>
+      <w:r>
+        <w:t xml:space="preserve"> </w:t>
+      </w:r>
+      <w:r>
+        <w:rPr>
+          <w:rFonts w:hint="eastAsia"/>
+        </w:rPr>
+        <w:t xml:space="preserve">(非例);</w:t>
+      </w:r>
+      <w:r>
+        <w:t xml:space="preserve"> Dà Xú’s analyses of </w:t>
+      </w:r>
+      <w:r>
+        <w:rPr>
+          <w:rFonts w:hint="eastAsia"/>
+        </w:rPr>
+        <w:t xml:space="preserve">婚</w:t>
       </w:r>
       <w:r>
         <w:t xml:space="preserve"> and </w:t>
@@ -1211,34 +1405,10 @@
         <w:rPr>
           <w:rFonts w:hint="eastAsia"/>
         </w:rPr>
-        <w:t xml:space="preserve">傾</w:t>
-      </w:r>
-      <w:r>
-        <w:t xml:space="preserve"> </w:t>
-      </w:r>
-      <w:r>
-        <w:t xml:space="preserve">“to lean”</w:t>
-      </w:r>
-      <w:r>
-        <w:t xml:space="preserve">, from </w:t>
-      </w:r>
-      <w:r>
-        <w:rPr>
-          <w:rFonts w:hint="eastAsia"/>
-        </w:rPr>
-        <w:t xml:space="preserve">頃,</w:t>
-      </w:r>
-      <w:r>
-        <w:t xml:space="preserve"> under </w:t>
-      </w:r>
-      <w:r>
-        <w:rPr>
-          <w:rFonts w:hint="eastAsia"/>
-        </w:rPr>
-        <w:t xml:space="preserve">人</w:t>
-      </w:r>
-      <w:r>
-        <w:t xml:space="preserve"> (Wang 1837, juan 8, as quoted in O 2015: 471–473). On our reading, these two are differentiated graphs whose label falls under Wang’s first or second kind. Differentiation thus cuts across his three kinds and reaches beyond the label altogether; what the third kind adds is a criterion of filing. Whether Wang illustrates that kind with examples of its own cannot be settled from the secondary sources.</w:t>
+        <w:t xml:space="preserve">媄</w:t>
+      </w:r>
+      <w:r>
+        <w:t xml:space="preserve"> he rejects in the same way (7b). Differentiation thus reaches well beyond the label, and what the third kind adds is a criterion of filing. Whether Wang illustrates that kind with examples of his own awaits the juan 3 passage itself.</w:t>
       </w:r>
     </w:p>
     <w:p>
@@ -1273,7 +1443,7 @@
         <w:t xml:space="preserve">徐灝</w:t>
       </w:r>
       <w:r>
-        <w:t xml:space="preserve"> rather than to Wang himself. Nor, in the passages available to us, does Wang ask how often the label and the differentiated graph coincide, or with what relation of sound.</w:t>
+        <w:t xml:space="preserve"> rather than to Wang himself. Nor, in the passages read so far, does Wang ask how often the label and the differentiated graph coincide, or with what relation of sound.</w:t>
       </w:r>
     </w:p>
     <w:p>
@@ -4483,7 +4653,130 @@
         <w:t xml:space="preserve">(貧</w:t>
       </w:r>
       <w:r>
-        <w:t xml:space="preserve"> among them) lack the label, and because the aligned entries are far less often homophonous than the rest (12 of 57 against 51 of 120), they cannot support an inference either way.</w:t>
+        <w:t xml:space="preserve"> among them) lack the label, and because the aligned entries are far less often homophonous than the rest (12 of 57 against 51 of 120), they cannot support an inference either way. Wang Yun supplies a partial check where the alignment fails. By his report Xiǎo Xú gives </w:t>
+      </w:r>
+      <w:r>
+        <w:rPr>
+          <w:rFonts w:hint="eastAsia"/>
+        </w:rPr>
+        <w:t xml:space="preserve">娶</w:t>
+      </w:r>
+      <w:r>
+        <w:t xml:space="preserve"> as </w:t>
+      </w:r>
+      <w:r>
+        <w:rPr>
+          <w:rFonts w:hint="eastAsia"/>
+        </w:rPr>
+        <w:t xml:space="preserve">取聲,</w:t>
+      </w:r>
+      <w:r>
+        <w:t xml:space="preserve"> and it</w:t>
+      </w:r>
+      <w:r>
+        <w:t xml:space="preserve"> </w:t>
+      </w:r>
+      <w:r>
+        <w:t xml:space="preserve">“is not wrong”</w:t>
+      </w:r>
+      <w:r>
+        <w:t xml:space="preserve"> </w:t>
+      </w:r>
+      <w:r>
+        <w:rPr>
+          <w:rFonts w:hint="eastAsia"/>
+        </w:rPr>
+        <w:t xml:space="preserve">(小徐不誤)</w:t>
+      </w:r>
+      <w:r>
+        <w:t xml:space="preserve"> where Dà Xú analyses </w:t>
+      </w:r>
+      <w:r>
+        <w:rPr>
+          <w:rFonts w:hint="eastAsia"/>
+        </w:rPr>
+        <w:t xml:space="preserve">婚</w:t>
+      </w:r>
+      <w:r>
+        <w:t xml:space="preserve"> and </w:t>
+      </w:r>
+      <w:r>
+        <w:rPr>
+          <w:rFonts w:hint="eastAsia"/>
+        </w:rPr>
+        <w:t xml:space="preserve">媄</w:t>
+      </w:r>
+      <w:r>
+        <w:t xml:space="preserve"> as </w:t>
+      </w:r>
+      <w:r>
+        <w:rPr>
+          <w:rFonts w:hint="eastAsia"/>
+        </w:rPr>
+        <w:t xml:space="preserve">从昏</w:t>
+      </w:r>
+      <w:r>
+        <w:t xml:space="preserve"> and </w:t>
+      </w:r>
+      <w:r>
+        <w:rPr>
+          <w:rFonts w:hint="eastAsia"/>
+        </w:rPr>
+        <w:t xml:space="preserve">从美</w:t>
+      </w:r>
+      <w:r>
+        <w:t xml:space="preserve"> (juan 8, 7b); Duan, too, drops the label from </w:t>
+      </w:r>
+      <w:r>
+        <w:rPr>
+          <w:rFonts w:hint="eastAsia"/>
+        </w:rPr>
+        <w:t xml:space="preserve">娶</w:t>
+      </w:r>
+      <w:r>
+        <w:t xml:space="preserve"> and </w:t>
+      </w:r>
+      <w:r>
+        <w:rPr>
+          <w:rFonts w:hint="eastAsia"/>
+        </w:rPr>
+        <w:t xml:space="preserve">媄.</w:t>
+      </w:r>
+      <w:r>
+        <w:t xml:space="preserve"> All three are pairs of the kind the label favours: </w:t>
+      </w:r>
+      <w:r>
+        <w:rPr>
+          <w:rFonts w:hint="eastAsia"/>
+        </w:rPr>
+        <w:t xml:space="preserve">婚</w:t>
+      </w:r>
+      <w:r>
+        <w:t xml:space="preserve"> and </w:t>
+      </w:r>
+      <w:r>
+        <w:rPr>
+          <w:rFonts w:hint="eastAsia"/>
+        </w:rPr>
+        <w:t xml:space="preserve">媄</w:t>
+      </w:r>
+      <w:r>
+        <w:t xml:space="preserve"> are homophonous with their phonetics, and </w:t>
+      </w:r>
+      <w:r>
+        <w:rPr>
+          <w:rFonts w:hint="eastAsia"/>
+        </w:rPr>
+        <w:t xml:space="preserve">娶</w:t>
+      </w:r>
+      <w:r>
+        <w:t xml:space="preserve"> is the departing-tone member beside </w:t>
+      </w:r>
+      <w:r>
+        <w:rPr>
+          <w:rFonts w:hint="eastAsia"/>
+        </w:rPr>
+        <w:t xml:space="preserve">取.</w:t>
       </w:r>
     </w:p>
     <w:p>
@@ -4964,16 +5257,25 @@
         <w:t xml:space="preserve">tshjuX</w:t>
       </w:r>
       <w:r>
-        <w:t xml:space="preserve">), the relation tested in H1c, yet Wang calls it a differentiated graph all the same. What the population adds is scale, and a test of the filing criterion. On the first-pass coding, a new graph for the same word or for one of its senses (L or F) accounts for 50 of the 63 homophonous labelled pairs, against 18 of the 133 homophonous ordinary ones. The filing criterion, by contrast, does not pick out homophony at all (Section 4.5), and both of Wang’s labelled examples are filed elsewhere. Differentiation runs through the label, not through one kind of it. It also runs beyond the label, since Wang applied the term to characters such as </w:t>
-      </w:r>
-      <w:r>
-        <w:rPr>
-          <w:rFonts w:hint="eastAsia"/>
-        </w:rPr>
-        <w:t xml:space="preserve">恭</w:t>
-      </w:r>
-      <w:r>
-        <w:t xml:space="preserve"> that Xu treats as ordinary compounds; the label is best read as marking the pairs in which Xu recognised the relation, a reliable but not exhaustive sample of it. And where Wang’s graphic categories treat </w:t>
+        <w:t xml:space="preserve">), the relation tested in H1c, yet Wang calls it a differentiated graph all the same. What the population adds is scale, and a test of the filing criterion. On the first-pass coding, a new graph for the same word or for one of its senses (L or F) accounts for 50 of the 63 homophonous labelled pairs, against 18 of the 133 homophonous ordinary ones. The filing criterion, by contrast, does not pick out homophony at all (Section 4.5), and the labels Wang accepts on </w:t>
+      </w:r>
+      <w:r>
+        <w:rPr>
+          <w:rFonts w:hint="eastAsia"/>
+        </w:rPr>
+        <w:t xml:space="preserve">傾</w:t>
+      </w:r>
+      <w:r>
+        <w:t xml:space="preserve"> and </w:t>
+      </w:r>
+      <w:r>
+        <w:rPr>
+          <w:rFonts w:hint="eastAsia"/>
+        </w:rPr>
+        <w:t xml:space="preserve">𨻺</w:t>
+      </w:r>
+      <w:r>
+        <w:t xml:space="preserve"> stand outside the base’s section. Differentiation runs through the label, not through one kind of it. It also runs beyond the label, as Wang himself insisted when he took the plain phonetic to be Xu’s usual formula for differentiated graphs; the label is best read as marking the pairs in which Xu recognised the relation, a reliable but not exhaustive sample of it. And where Wang’s graphic categories treat </w:t>
       </w:r>
       <w:r>
         <w:rPr>
@@ -5199,23 +5501,34 @@
         <w:t xml:space="preserve"> </w:t>
       </w:r>
       <w:r>
-        <w:t xml:space="preserve">and a Xiǎo Xú e-text too incomplete to test H3; every cited form must be checked in print, above all against the 1963 Zhonghua facsimile of the Dà Xú. Wang Yun, moreover, is quoted here at second hand, and our reading of his third kind, including whether his</w:t>
-      </w:r>
-      <w:r>
-        <w:t xml:space="preserve"> </w:t>
-      </w:r>
-      <w:r>
-        <w:rPr>
-          <w:i/>
-          <w:iCs/>
-        </w:rPr>
-        <w:t xml:space="preserve">yìshēng</w:t>
-      </w:r>
-      <w:r>
-        <w:t xml:space="preserve"> </w:t>
-      </w:r>
-      <w:r>
-        <w:t xml:space="preserve">section gives examples of it, awaits the original. And because the hypotheses were refined after an exploratory look, every test is reported, the null for H1b and the unplanned decomposition of H1c included.</w:t>
+        <w:t xml:space="preserve">and a Xiǎo Xú e-text too incomplete to test H3; every cited form must be checked in print, above all against the 1963 Zhonghua facsimile of the Dà Xú. The gap in H3 matters more than a null result suggests. Wang held the plain phonetic to be Xu’s convention for differentiated graphs, and he rejected three Dà Xú labels, on </w:t>
+      </w:r>
+      <w:r>
+        <w:rPr>
+          <w:rFonts w:hint="eastAsia"/>
+        </w:rPr>
+        <w:t xml:space="preserve">娶,</w:t>
+      </w:r>
+      <w:r>
+        <w:t xml:space="preserve"> </w:t>
+      </w:r>
+      <w:r>
+        <w:rPr>
+          <w:rFonts w:hint="eastAsia"/>
+        </w:rPr>
+        <w:t xml:space="preserve">婚</w:t>
+      </w:r>
+      <w:r>
+        <w:t xml:space="preserve"> and </w:t>
+      </w:r>
+      <w:r>
+        <w:rPr>
+          <w:rFonts w:hint="eastAsia"/>
+        </w:rPr>
+        <w:t xml:space="preserve">媄,</w:t>
+      </w:r>
+      <w:r>
+        <w:t xml:space="preserve"> that Xiǎo Xú lacks. If labels of this kind were added by Xu Xuan rather than written by Xu Shen, part of the association reported here belongs to the Song editor, and only a collation of the Xiǎo Xú in facsimile can say how large that part is. Wang himself is cited from a first-pass transcription of a scan of juan 8 that has yet to be checked, and his juan 3 only at second hand; our reading of the third kind, including whether he illustrates it, awaits that passage. And because the hypotheses were refined after an exploratory look, every test is reported, the null for H1b and the unplanned decomposition of H1c included.</w:t>
       </w:r>
     </w:p>
     <w:bookmarkEnd w:id="31"/>
@@ -6581,7 +6894,7 @@
         <w:t xml:space="preserve">Shuōwén</w:t>
       </w:r>
       <w:r>
-        <w:t xml:space="preserve">]. Reprint, Beijing: Zhonghua shuju, 1988 (as cited in O 2015; edition and date not yet checked). Quoted here through O 2015 and Li &amp; Guo 2019. †</w:t>
+        <w:t xml:space="preserve">]. Juan 8 cited from a scan of an early print (archive.org item 02076575.cn; printing not identified); juan 3 quoted through Li &amp; Guo 2019. Reprint, Beijing: Zhonghua shuju, 1988, as cited in O 2015. †</w:t>
       </w:r>
     </w:p>
     <w:p>

</xml_diff>